<commit_message>
Actualización 14 abril 12 m
</commit_message>
<xml_diff>
--- a/frecuencias acumuladas.docx
+++ b/frecuencias acumuladas.docx
@@ -25,55 +25,27 @@
         <w:rPr>
           <w:lang w:val="en-US"/>
         </w:rPr>
-        <w:t xml:space="preserve">import </w:t>
-      </w:r>
-      <w:proofErr w:type="spellStart"/>
-      <w:r>
-        <w:rPr>
-          <w:lang w:val="en-US"/>
-        </w:rPr>
-        <w:t>numpy</w:t>
-      </w:r>
-      <w:proofErr w:type="spellEnd"/>
-      <w:r>
-        <w:rPr>
-          <w:lang w:val="en-US"/>
-        </w:rPr>
-        <w:t xml:space="preserve"> as np</w:t>
-      </w:r>
-    </w:p>
-    <w:p>
-      <w:pPr>
-        <w:rPr>
-          <w:lang w:val="en-US"/>
-        </w:rPr>
-      </w:pPr>
-    </w:p>
-    <w:p>
-      <w:pPr>
-        <w:rPr>
-          <w:lang w:val="en-US"/>
-        </w:rPr>
-      </w:pPr>
-      <w:r>
-        <w:rPr>
-          <w:lang w:val="en-US"/>
-        </w:rPr>
-        <w:t xml:space="preserve"># ── Datos de </w:t>
-      </w:r>
-      <w:proofErr w:type="spellStart"/>
-      <w:r>
-        <w:rPr>
-          <w:lang w:val="en-US"/>
-        </w:rPr>
-        <w:t>ejemplo</w:t>
-      </w:r>
-      <w:proofErr w:type="spellEnd"/>
-      <w:r>
-        <w:rPr>
-          <w:lang w:val="en-US"/>
-        </w:rPr>
-        <w:t xml:space="preserve"> ──────────────────────────────────────────────</w:t>
+        <w:t>import numpy as np</w:t>
+      </w:r>
+    </w:p>
+    <w:p>
+      <w:pPr>
+        <w:rPr>
+          <w:lang w:val="en-US"/>
+        </w:rPr>
+      </w:pPr>
+    </w:p>
+    <w:p>
+      <w:pPr>
+        <w:rPr>
+          <w:lang w:val="en-US"/>
+        </w:rPr>
+      </w:pPr>
+      <w:r>
+        <w:rPr>
+          <w:lang w:val="en-US"/>
+        </w:rPr>
+        <w:t># ── Datos de ejemplo ──────────────────────────────────────────────</w:t>
       </w:r>
     </w:p>
     <w:p>
@@ -99,75 +71,33 @@
         <w:rPr>
           <w:lang w:val="en-US"/>
         </w:rPr>
-        <w:t xml:space="preserve">    "</w:t>
-      </w:r>
-      <w:proofErr w:type="spellStart"/>
-      <w:r>
-        <w:rPr>
-          <w:lang w:val="en-US"/>
-        </w:rPr>
-        <w:t>nombre</w:t>
-      </w:r>
-      <w:proofErr w:type="spellEnd"/>
-      <w:r>
-        <w:rPr>
-          <w:lang w:val="en-US"/>
-        </w:rPr>
-        <w:t>": ["Ana", "Luis", "María", "Pedro", "Sara", "Juan", "Laura", "Carlos"],</w:t>
-      </w:r>
-    </w:p>
-    <w:p>
-      <w:pPr>
-        <w:rPr>
-          <w:lang w:val="en-US"/>
-        </w:rPr>
-      </w:pPr>
-      <w:r>
-        <w:rPr>
-          <w:lang w:val="en-US"/>
-        </w:rPr>
-        <w:t xml:space="preserve">    "edad":</w:t>
-      </w:r>
-      <w:proofErr w:type="gramStart"/>
-      <w:r>
-        <w:rPr>
-          <w:lang w:val="en-US"/>
-        </w:rPr>
-        <w:t xml:space="preserve">   [</w:t>
-      </w:r>
-      <w:proofErr w:type="gramEnd"/>
-      <w:r>
-        <w:rPr>
-          <w:lang w:val="en-US"/>
-        </w:rPr>
-        <w:t>23, 35, 28, 41, 23, 35, 28, 23],</w:t>
-      </w:r>
-    </w:p>
-    <w:p>
-      <w:pPr>
-        <w:rPr>
-          <w:lang w:val="en-US"/>
-        </w:rPr>
-      </w:pPr>
-      <w:r>
-        <w:rPr>
-          <w:lang w:val="en-US"/>
-        </w:rPr>
-        <w:t xml:space="preserve">    "nota":</w:t>
-      </w:r>
-      <w:proofErr w:type="gramStart"/>
-      <w:r>
-        <w:rPr>
-          <w:lang w:val="en-US"/>
-        </w:rPr>
-        <w:t xml:space="preserve">   [</w:t>
-      </w:r>
-      <w:proofErr w:type="gramEnd"/>
-      <w:r>
-        <w:rPr>
-          <w:lang w:val="en-US"/>
-        </w:rPr>
-        <w:t>7.5, 8.0, 6.0, 9.5, 7.5, 8.0, 6.5, 9.0],</w:t>
+        <w:t xml:space="preserve">    "nombre": ["Ana", "Luis", "María", "Pedro", "Sara", "Juan", "Laura", "Carlos"],</w:t>
+      </w:r>
+    </w:p>
+    <w:p>
+      <w:pPr>
+        <w:rPr>
+          <w:lang w:val="en-US"/>
+        </w:rPr>
+      </w:pPr>
+      <w:r>
+        <w:rPr>
+          <w:lang w:val="en-US"/>
+        </w:rPr>
+        <w:t xml:space="preserve">    "edad":   [23, 35, 28, 41, 23, 35, 28, 23],</w:t>
+      </w:r>
+    </w:p>
+    <w:p>
+      <w:pPr>
+        <w:rPr>
+          <w:lang w:val="en-US"/>
+        </w:rPr>
+      </w:pPr>
+      <w:r>
+        <w:rPr>
+          <w:lang w:val="en-US"/>
+        </w:rPr>
+        <w:t xml:space="preserve">    "nota":   [7.5, 8.0, 6.0, 9.5, 7.5, 8.0, 6.5, 9.0],</w:t>
       </w:r>
     </w:p>
     <w:p>
@@ -193,21 +123,7 @@
         <w:rPr>
           <w:lang w:val="en-US"/>
         </w:rPr>
-        <w:t xml:space="preserve">df = </w:t>
-      </w:r>
-      <w:proofErr w:type="gramStart"/>
-      <w:r>
-        <w:rPr>
-          <w:lang w:val="en-US"/>
-        </w:rPr>
-        <w:t>pd.DataFrame</w:t>
-      </w:r>
-      <w:proofErr w:type="gramEnd"/>
-      <w:r>
-        <w:rPr>
-          <w:lang w:val="en-US"/>
-        </w:rPr>
-        <w:t>(data)</w:t>
+        <w:t>df = pd.DataFrame(data)</w:t>
       </w:r>
     </w:p>
     <w:p>
@@ -231,53 +147,8 @@
       </w:r>
     </w:p>
     <w:p>
-      <w:proofErr w:type="spellStart"/>
-      <w:r>
-        <w:t>def</w:t>
-      </w:r>
-      <w:proofErr w:type="spellEnd"/>
-      <w:r>
-        <w:t xml:space="preserve"> </w:t>
-      </w:r>
-      <w:proofErr w:type="spellStart"/>
-      <w:r>
-        <w:t>tabla_frecuencias</w:t>
-      </w:r>
-      <w:proofErr w:type="spellEnd"/>
-      <w:r>
-        <w:t>(</w:t>
-      </w:r>
-      <w:proofErr w:type="spellStart"/>
-      <w:r>
-        <w:t>df</w:t>
-      </w:r>
-      <w:proofErr w:type="spellEnd"/>
-      <w:r>
-        <w:t xml:space="preserve">: </w:t>
-      </w:r>
-      <w:proofErr w:type="spellStart"/>
-      <w:r>
-        <w:t>pd.DataFrame</w:t>
-      </w:r>
-      <w:proofErr w:type="spellEnd"/>
-      <w:r>
-        <w:t xml:space="preserve">, campo: </w:t>
-      </w:r>
-      <w:proofErr w:type="spellStart"/>
-      <w:r>
-        <w:t>str</w:t>
-      </w:r>
-      <w:proofErr w:type="spellEnd"/>
-      <w:r>
-        <w:t xml:space="preserve">) -&gt; </w:t>
-      </w:r>
-      <w:proofErr w:type="spellStart"/>
-      <w:r>
-        <w:t>pd.DataFrame</w:t>
-      </w:r>
-      <w:proofErr w:type="spellEnd"/>
-      <w:r>
-        <w:t>:</w:t>
+      <w:r>
+        <w:t>def tabla_frecuencias(df: pd.DataFrame, campo: str) -&gt; pd.DataFrame:</w:t>
       </w:r>
     </w:p>
     <w:p>
@@ -303,299 +174,150 @@
     </w:p>
     <w:p>
       <w:r>
+        <w:t xml:space="preserve">        n_i  → frecuencia absoluta</w:t>
+      </w:r>
+    </w:p>
+    <w:p>
+      <w:r>
+        <w:t xml:space="preserve">        f_i  → frecuencia relativa  (n_i / N)</w:t>
+      </w:r>
+    </w:p>
+    <w:p>
+      <w:r>
+        <w:t xml:space="preserve">        N_i  → frecuencia absoluta acumulada</w:t>
+      </w:r>
+    </w:p>
+    <w:p>
+      <w:r>
+        <w:t xml:space="preserve">        F_i  → frecuencia relativa acumulada</w:t>
+      </w:r>
+    </w:p>
+    <w:p>
+      <w:r>
+        <w:t xml:space="preserve">    """</w:t>
+      </w:r>
+    </w:p>
+    <w:p>
+      <w:r>
+        <w:t xml:space="preserve">    # Frecuencia absoluta ordenada ascendente</w:t>
+      </w:r>
+    </w:p>
+    <w:p>
+      <w:r>
+        <w:t xml:space="preserve">    freq = (</w:t>
+      </w:r>
+    </w:p>
+    <w:p>
+      <w:r>
+        <w:t xml:space="preserve">        df[campo]</w:t>
+      </w:r>
+    </w:p>
+    <w:p>
+      <w:r>
+        <w:t xml:space="preserve">        .value_counts()</w:t>
+      </w:r>
+    </w:p>
+    <w:p>
+      <w:r>
+        <w:t xml:space="preserve">        .sort_index()               # orden ascendente por valor</w:t>
+      </w:r>
+    </w:p>
+    <w:p>
+      <w:pPr>
+        <w:rPr>
+          <w:lang w:val="en-US"/>
+        </w:rPr>
+      </w:pPr>
+      <w:r>
         <w:t xml:space="preserve">        </w:t>
       </w:r>
-      <w:proofErr w:type="spellStart"/>
-      <w:r>
-        <w:t>n_i</w:t>
-      </w:r>
-      <w:proofErr w:type="spellEnd"/>
-      <w:r>
-        <w:t xml:space="preserve">  → frecuencia absoluta</w:t>
-      </w:r>
-    </w:p>
-    <w:p>
-      <w:r>
-        <w:t xml:space="preserve">        </w:t>
-      </w:r>
-      <w:proofErr w:type="spellStart"/>
-      <w:r>
-        <w:t>f_i</w:t>
-      </w:r>
-      <w:proofErr w:type="spellEnd"/>
-      <w:r>
-        <w:t xml:space="preserve">  → frecuencia relativa  (</w:t>
-      </w:r>
-      <w:proofErr w:type="spellStart"/>
-      <w:r>
-        <w:t>n_i</w:t>
-      </w:r>
-      <w:proofErr w:type="spellEnd"/>
-      <w:r>
-        <w:t xml:space="preserve"> / N)</w:t>
-      </w:r>
-    </w:p>
-    <w:p>
-      <w:r>
-        <w:t xml:space="preserve">        </w:t>
-      </w:r>
-      <w:proofErr w:type="spellStart"/>
-      <w:r>
-        <w:t>N_i</w:t>
-      </w:r>
-      <w:proofErr w:type="spellEnd"/>
-      <w:r>
-        <w:t xml:space="preserve">  → frecuencia absoluta acumulada</w:t>
-      </w:r>
-    </w:p>
-    <w:p>
-      <w:r>
-        <w:t xml:space="preserve">        </w:t>
-      </w:r>
-      <w:proofErr w:type="spellStart"/>
-      <w:r>
-        <w:t>F_i</w:t>
-      </w:r>
-      <w:proofErr w:type="spellEnd"/>
-      <w:r>
-        <w:t xml:space="preserve">  → frecuencia relativa acumulada</w:t>
-      </w:r>
-    </w:p>
-    <w:p>
-      <w:r>
-        <w:t xml:space="preserve">    """</w:t>
-      </w:r>
-    </w:p>
-    <w:p>
-      <w:r>
-        <w:t xml:space="preserve">    # Frecuencia absoluta ordenada ascendente</w:t>
-      </w:r>
-    </w:p>
-    <w:p>
-      <w:r>
+      <w:r>
+        <w:rPr>
+          <w:lang w:val="en-US"/>
+        </w:rPr>
+        <w:t>.reset_index()</w:t>
+      </w:r>
+    </w:p>
+    <w:p>
+      <w:pPr>
+        <w:rPr>
+          <w:lang w:val="en-US"/>
+        </w:rPr>
+      </w:pPr>
+      <w:r>
+        <w:rPr>
+          <w:lang w:val="en-US"/>
+        </w:rPr>
+        <w:t xml:space="preserve">    )</w:t>
+      </w:r>
+    </w:p>
+    <w:p>
+      <w:pPr>
+        <w:rPr>
+          <w:lang w:val="en-US"/>
+        </w:rPr>
+      </w:pPr>
+      <w:r>
+        <w:rPr>
+          <w:lang w:val="en-US"/>
+        </w:rPr>
+        <w:t xml:space="preserve">    freq.columns = [campo, "n_i"]</w:t>
+      </w:r>
+    </w:p>
+    <w:p>
+      <w:pPr>
+        <w:rPr>
+          <w:lang w:val="en-US"/>
+        </w:rPr>
+      </w:pPr>
+    </w:p>
+    <w:p>
+      <w:pPr>
+        <w:rPr>
+          <w:lang w:val="en-US"/>
+        </w:rPr>
+      </w:pPr>
+      <w:r>
+        <w:rPr>
+          <w:lang w:val="en-US"/>
+        </w:rPr>
+        <w:t xml:space="preserve">    N = freq["n_i"].sum()           # total de registros</w:t>
+      </w:r>
+    </w:p>
+    <w:p>
+      <w:pPr>
+        <w:rPr>
+          <w:lang w:val="en-US"/>
+        </w:rPr>
+      </w:pPr>
+    </w:p>
+    <w:p>
+      <w:pPr>
+        <w:rPr>
+          <w:lang w:val="en-US"/>
+        </w:rPr>
+      </w:pPr>
+      <w:r>
+        <w:rPr>
+          <w:lang w:val="en-US"/>
+        </w:rPr>
+        <w:t xml:space="preserve">    freq["f_i"] = freq["n_i"] / N                    # relativa</w:t>
+      </w:r>
+    </w:p>
+    <w:p>
+      <w:r>
+        <w:rPr>
+          <w:lang w:val="en-US"/>
+        </w:rPr>
         <w:t xml:space="preserve">    </w:t>
       </w:r>
-      <w:proofErr w:type="spellStart"/>
-      <w:r>
-        <w:t>freq</w:t>
-      </w:r>
-      <w:proofErr w:type="spellEnd"/>
-      <w:r>
-        <w:t xml:space="preserve"> = (</w:t>
-      </w:r>
-    </w:p>
-    <w:p>
-      <w:r>
-        <w:t xml:space="preserve">        </w:t>
-      </w:r>
-      <w:proofErr w:type="spellStart"/>
-      <w:r>
-        <w:t>df</w:t>
-      </w:r>
-      <w:proofErr w:type="spellEnd"/>
-      <w:r>
-        <w:t>[campo]</w:t>
-      </w:r>
-    </w:p>
-    <w:p>
-      <w:r>
-        <w:t xml:space="preserve">        .</w:t>
-      </w:r>
-      <w:proofErr w:type="spellStart"/>
-      <w:r>
-        <w:t>value_counts</w:t>
-      </w:r>
-      <w:proofErr w:type="spellEnd"/>
-      <w:r>
-        <w:t>()</w:t>
-      </w:r>
-    </w:p>
-    <w:p>
-      <w:r>
-        <w:t xml:space="preserve">        .</w:t>
-      </w:r>
-      <w:proofErr w:type="spellStart"/>
-      <w:r>
-        <w:t>sort_index</w:t>
-      </w:r>
-      <w:proofErr w:type="spellEnd"/>
-      <w:r>
-        <w:t>()               # orden ascendente por valor</w:t>
-      </w:r>
-    </w:p>
-    <w:p>
-      <w:pPr>
-        <w:rPr>
-          <w:lang w:val="en-US"/>
-        </w:rPr>
-      </w:pPr>
-      <w:r>
-        <w:t xml:space="preserve">        </w:t>
-      </w:r>
-      <w:r>
-        <w:rPr>
-          <w:lang w:val="en-US"/>
-        </w:rPr>
-        <w:t>.reset_index()</w:t>
-      </w:r>
-    </w:p>
-    <w:p>
-      <w:pPr>
-        <w:rPr>
-          <w:lang w:val="en-US"/>
-        </w:rPr>
-      </w:pPr>
-      <w:r>
-        <w:rPr>
-          <w:lang w:val="en-US"/>
-        </w:rPr>
-        <w:t xml:space="preserve">    )</w:t>
-      </w:r>
-    </w:p>
-    <w:p>
-      <w:pPr>
-        <w:rPr>
-          <w:lang w:val="en-US"/>
-        </w:rPr>
-      </w:pPr>
-      <w:r>
-        <w:rPr>
-          <w:lang w:val="en-US"/>
-        </w:rPr>
-        <w:t xml:space="preserve">    freq.columns = [campo, "n_i"]</w:t>
-      </w:r>
-    </w:p>
-    <w:p>
-      <w:pPr>
-        <w:rPr>
-          <w:lang w:val="en-US"/>
-        </w:rPr>
-      </w:pPr>
-    </w:p>
-    <w:p>
-      <w:pPr>
-        <w:rPr>
-          <w:lang w:val="en-US"/>
-        </w:rPr>
-      </w:pPr>
-      <w:r>
-        <w:rPr>
-          <w:lang w:val="en-US"/>
-        </w:rPr>
-        <w:t xml:space="preserve">    N = freq["n_i"].sum()           # total de registros</w:t>
-      </w:r>
-    </w:p>
-    <w:p>
-      <w:pPr>
-        <w:rPr>
-          <w:lang w:val="en-US"/>
-        </w:rPr>
-      </w:pPr>
-    </w:p>
-    <w:p>
-      <w:pPr>
-        <w:rPr>
-          <w:lang w:val="en-US"/>
-        </w:rPr>
-      </w:pPr>
-      <w:r>
-        <w:rPr>
-          <w:lang w:val="en-US"/>
-        </w:rPr>
-        <w:t xml:space="preserve">    freq["f_i"] = freq["n_i"] / N                    # relativa</w:t>
-      </w:r>
-    </w:p>
-    <w:p>
-      <w:r>
-        <w:rPr>
-          <w:lang w:val="en-US"/>
-        </w:rPr>
-        <w:t xml:space="preserve">    </w:t>
-      </w:r>
-      <w:proofErr w:type="spellStart"/>
-      <w:r>
-        <w:t>freq</w:t>
-      </w:r>
-      <w:proofErr w:type="spellEnd"/>
-      <w:r>
-        <w:t>["</w:t>
-      </w:r>
-      <w:proofErr w:type="spellStart"/>
-      <w:r>
-        <w:t>N_i</w:t>
-      </w:r>
-      <w:proofErr w:type="spellEnd"/>
-      <w:r>
-        <w:t xml:space="preserve">"] = </w:t>
-      </w:r>
-      <w:proofErr w:type="spellStart"/>
-      <w:r>
-        <w:t>freq</w:t>
-      </w:r>
-      <w:proofErr w:type="spellEnd"/>
-      <w:r>
-        <w:t>["</w:t>
-      </w:r>
-      <w:proofErr w:type="spellStart"/>
-      <w:r>
-        <w:t>n_i</w:t>
-      </w:r>
-      <w:proofErr w:type="spellEnd"/>
-      <w:r>
-        <w:t>"].</w:t>
-      </w:r>
-      <w:proofErr w:type="spellStart"/>
-      <w:r>
-        <w:t>cumsum</w:t>
-      </w:r>
-      <w:proofErr w:type="spellEnd"/>
-      <w:r>
-        <w:t>()               # absoluta acumulada</w:t>
-      </w:r>
-    </w:p>
-    <w:p>
-      <w:r>
-        <w:t xml:space="preserve">    </w:t>
-      </w:r>
-      <w:proofErr w:type="spellStart"/>
-      <w:r>
-        <w:t>freq</w:t>
-      </w:r>
-      <w:proofErr w:type="spellEnd"/>
-      <w:r>
-        <w:t>["</w:t>
-      </w:r>
-      <w:proofErr w:type="spellStart"/>
-      <w:r>
-        <w:t>F_i</w:t>
-      </w:r>
-      <w:proofErr w:type="spellEnd"/>
-      <w:r>
-        <w:t xml:space="preserve">"] = </w:t>
-      </w:r>
-      <w:proofErr w:type="spellStart"/>
-      <w:r>
-        <w:t>freq</w:t>
-      </w:r>
-      <w:proofErr w:type="spellEnd"/>
-      <w:r>
-        <w:t>["</w:t>
-      </w:r>
-      <w:proofErr w:type="spellStart"/>
-      <w:r>
-        <w:t>f_i</w:t>
-      </w:r>
-      <w:proofErr w:type="spellEnd"/>
-      <w:r>
-        <w:t>"].</w:t>
-      </w:r>
-      <w:proofErr w:type="spellStart"/>
-      <w:r>
-        <w:t>cumsum</w:t>
-      </w:r>
-      <w:proofErr w:type="spellEnd"/>
-      <w:r>
-        <w:t>()               # relativa acumulada</w:t>
+      <w:r>
+        <w:t>freq["N_i"] = freq["n_i"].cumsum()               # absoluta acumulada</w:t>
+      </w:r>
+    </w:p>
+    <w:p>
+      <w:r>
+        <w:t xml:space="preserve">    freq["F_i"] = freq["f_i"].cumsum()               # relativa acumulada</w:t>
       </w:r>
     </w:p>
     <w:p/>
@@ -606,39 +328,7 @@
     </w:p>
     <w:p>
       <w:r>
-        <w:t xml:space="preserve">    </w:t>
-      </w:r>
-      <w:proofErr w:type="spellStart"/>
-      <w:r>
-        <w:t>assert</w:t>
-      </w:r>
-      <w:proofErr w:type="spellEnd"/>
-      <w:r>
-        <w:t xml:space="preserve"> </w:t>
-      </w:r>
-      <w:proofErr w:type="spellStart"/>
-      <w:r>
-        <w:t>freq</w:t>
-      </w:r>
-      <w:proofErr w:type="spellEnd"/>
-      <w:r>
-        <w:t>["</w:t>
-      </w:r>
-      <w:proofErr w:type="spellStart"/>
-      <w:r>
-        <w:t>N_i</w:t>
-      </w:r>
-      <w:proofErr w:type="spellEnd"/>
-      <w:r>
-        <w:t>"].</w:t>
-      </w:r>
-      <w:proofErr w:type="spellStart"/>
-      <w:r>
-        <w:t>iloc</w:t>
-      </w:r>
-      <w:proofErr w:type="spellEnd"/>
-      <w:r>
-        <w:t>[-1] == N, "Error: la suma acumulada no coincide con N"</w:t>
+        <w:t xml:space="preserve">    assert freq["N_i"].iloc[-1] == N, "Error: la suma acumulada no coincide con N"</w:t>
       </w:r>
     </w:p>
     <w:p>
@@ -712,145 +402,2056 @@
       </w:r>
     </w:p>
     <w:p>
-      <w:proofErr w:type="spellStart"/>
-      <w:r>
-        <w:t>tabla_nota</w:t>
-      </w:r>
-      <w:proofErr w:type="spellEnd"/>
-      <w:r>
-        <w:t xml:space="preserve">  = </w:t>
-      </w:r>
-      <w:proofErr w:type="spellStart"/>
-      <w:r>
-        <w:t>tabla_frecuencias</w:t>
-      </w:r>
-      <w:proofErr w:type="spellEnd"/>
-      <w:r>
-        <w:t>(</w:t>
-      </w:r>
-      <w:proofErr w:type="spellStart"/>
-      <w:r>
-        <w:t>df</w:t>
-      </w:r>
-      <w:proofErr w:type="spellEnd"/>
-      <w:r>
-        <w:t>, "nota")</w:t>
+      <w:r>
+        <w:t>tabla_nota  = tabla_frecuencias(df, "nota")</w:t>
       </w:r>
     </w:p>
     <w:p/>
     <w:p>
-      <w:proofErr w:type="spellStart"/>
-      <w:r>
-        <w:t>print</w:t>
-      </w:r>
-      <w:proofErr w:type="spellEnd"/>
-      <w:r>
-        <w:t>("=== Frecuencias de EDAD ===")</w:t>
-      </w:r>
-    </w:p>
-    <w:p>
-      <w:proofErr w:type="spellStart"/>
-      <w:r>
-        <w:t>print</w:t>
-      </w:r>
-      <w:proofErr w:type="spellEnd"/>
-      <w:r>
-        <w:t>(</w:t>
-      </w:r>
-      <w:proofErr w:type="spellStart"/>
-      <w:r>
-        <w:t>tabla_edad.to_string</w:t>
-      </w:r>
-      <w:proofErr w:type="spellEnd"/>
-      <w:r>
-        <w:t>())</w:t>
-      </w:r>
-    </w:p>
-    <w:p>
-      <w:proofErr w:type="spellStart"/>
-      <w:r>
-        <w:t>print</w:t>
-      </w:r>
-      <w:proofErr w:type="spellEnd"/>
-      <w:r>
-        <w:t>(f"\</w:t>
-      </w:r>
-      <w:proofErr w:type="spellStart"/>
-      <w:r>
-        <w:t>nN</w:t>
-      </w:r>
-      <w:proofErr w:type="spellEnd"/>
-      <w:r>
-        <w:t xml:space="preserve"> total: {</w:t>
-      </w:r>
-      <w:proofErr w:type="spellStart"/>
-      <w:r>
-        <w:t>tabla_edad</w:t>
-      </w:r>
-      <w:proofErr w:type="spellEnd"/>
-      <w:r>
-        <w:t>['</w:t>
-      </w:r>
-      <w:proofErr w:type="spellStart"/>
-      <w:r>
-        <w:t>n_i</w:t>
-      </w:r>
-      <w:proofErr w:type="spellEnd"/>
-      <w:r>
-        <w:t>'].sum()}")</w:t>
+      <w:r>
+        <w:t>print("=== Frecuencias de EDAD ===")</w:t>
+      </w:r>
+    </w:p>
+    <w:p>
+      <w:r>
+        <w:t>print(tabla_edad.to_string())</w:t>
+      </w:r>
+    </w:p>
+    <w:p>
+      <w:r>
+        <w:t>print(f"\nN total: {tabla_edad['n_i'].sum()}")</w:t>
       </w:r>
     </w:p>
     <w:p/>
     <w:p>
-      <w:proofErr w:type="spellStart"/>
-      <w:r>
-        <w:t>print</w:t>
-      </w:r>
-      <w:proofErr w:type="spellEnd"/>
-      <w:r>
-        <w:t>("\n=== Frecuencias de NOTA ===")</w:t>
-      </w:r>
-    </w:p>
-    <w:p>
-      <w:pPr>
-        <w:rPr>
-          <w:lang w:val="en-US"/>
-        </w:rPr>
-      </w:pPr>
-      <w:r>
-        <w:rPr>
-          <w:lang w:val="en-US"/>
-        </w:rPr>
-        <w:t>print(</w:t>
-      </w:r>
-      <w:proofErr w:type="spellStart"/>
-      <w:r>
-        <w:rPr>
-          <w:lang w:val="en-US"/>
-        </w:rPr>
-        <w:t>tabla_nota.to_</w:t>
-      </w:r>
-      <w:proofErr w:type="gramStart"/>
-      <w:r>
-        <w:rPr>
-          <w:lang w:val="en-US"/>
-        </w:rPr>
-        <w:t>string</w:t>
-      </w:r>
-      <w:proofErr w:type="spellEnd"/>
-      <w:r>
-        <w:rPr>
-          <w:lang w:val="en-US"/>
-        </w:rPr>
-        <w:t>(</w:t>
-      </w:r>
-      <w:proofErr w:type="gramEnd"/>
-      <w:r>
-        <w:rPr>
-          <w:lang w:val="en-US"/>
-        </w:rPr>
-        <w:t>))</w:t>
-      </w:r>
+      <w:r>
+        <w:t>print("\n=== Frecuencias de NOTA ===")</w:t>
+      </w:r>
+    </w:p>
+    <w:p>
+      <w:pPr>
+        <w:rPr>
+          <w:lang w:val="en-US"/>
+        </w:rPr>
+      </w:pPr>
+      <w:r>
+        <w:rPr>
+          <w:lang w:val="en-US"/>
+        </w:rPr>
+        <w:t>print(tabla_nota.to_string())</w:t>
+      </w:r>
+    </w:p>
+    <w:p>
+      <w:pPr>
+        <w:rPr>
+          <w:lang w:val="en-US"/>
+        </w:rPr>
+      </w:pPr>
+      <w:r>
+        <w:rPr>
+          <w:lang w:val="en-US"/>
+        </w:rPr>
+        <w:br w:type="page"/>
+      </w:r>
+    </w:p>
+    <w:p>
+      <w:pPr>
+        <w:rPr>
+          <w:lang w:val="en-US"/>
+        </w:rPr>
+      </w:pPr>
+      <w:r>
+        <w:rPr>
+          <w:lang w:val="en-US"/>
+        </w:rPr>
+        <w:lastRenderedPageBreak/>
+        <w:t>import holidays</w:t>
+      </w:r>
+    </w:p>
+    <w:p>
+      <w:pPr>
+        <w:rPr>
+          <w:lang w:val="en-US"/>
+        </w:rPr>
+      </w:pPr>
+      <w:r>
+        <w:rPr>
+          <w:lang w:val="en-US"/>
+        </w:rPr>
+        <w:t>import pandas as pd</w:t>
+      </w:r>
+    </w:p>
+    <w:p>
+      <w:pPr>
+        <w:rPr>
+          <w:lang w:val="en-US"/>
+        </w:rPr>
+      </w:pPr>
+    </w:p>
+    <w:p>
+      <w:pPr>
+        <w:rPr>
+          <w:lang w:val="en-US"/>
+        </w:rPr>
+      </w:pPr>
+      <w:r>
+        <w:rPr>
+          <w:lang w:val="en-US"/>
+        </w:rPr>
+        <w:t>co_holidays = holidays.Colombia(years=range(2024, 2026))</w:t>
+      </w:r>
+    </w:p>
+    <w:p>
+      <w:pPr>
+        <w:rPr>
+          <w:lang w:val="en-US"/>
+        </w:rPr>
+      </w:pPr>
+    </w:p>
+    <w:p>
+      <w:r>
+        <w:t>def tipo_dia(fecha):</w:t>
+      </w:r>
+    </w:p>
+    <w:p>
+      <w:r>
+        <w:t xml:space="preserve">    # Días no laborales</w:t>
+      </w:r>
+    </w:p>
+    <w:p>
+      <w:pPr>
+        <w:rPr>
+          <w:lang w:val="en-US"/>
+        </w:rPr>
+      </w:pPr>
+      <w:r>
+        <w:t xml:space="preserve">    </w:t>
+      </w:r>
+      <w:r>
+        <w:rPr>
+          <w:lang w:val="en-US"/>
+        </w:rPr>
+        <w:t>if fecha.weekday() &gt;= 5 or fecha in co_holidays:</w:t>
+      </w:r>
+    </w:p>
+    <w:p>
+      <w:r>
+        <w:rPr>
+          <w:lang w:val="en-US"/>
+        </w:rPr>
+        <w:t xml:space="preserve">        </w:t>
+      </w:r>
+      <w:r>
+        <w:t>return 3</w:t>
+      </w:r>
+    </w:p>
+    <w:p>
+      <w:r>
+        <w:t xml:space="preserve">    </w:t>
+      </w:r>
+    </w:p>
+    <w:p>
+      <w:r>
+        <w:t xml:space="preserve">    # Encontrar todos los días laborales de esa semana</w:t>
+      </w:r>
+    </w:p>
+    <w:p>
+      <w:r>
+        <w:t xml:space="preserve">    lunes = fecha - pd.Timedelta(days=fecha.weekday())</w:t>
+      </w:r>
+    </w:p>
+    <w:p>
+      <w:pPr>
+        <w:rPr>
+          <w:lang w:val="en-US"/>
+        </w:rPr>
+      </w:pPr>
+      <w:r>
+        <w:t xml:space="preserve">    </w:t>
+      </w:r>
+      <w:r>
+        <w:rPr>
+          <w:lang w:val="en-US"/>
+        </w:rPr>
+        <w:t>dias_semana = [lunes + pd.Timedelta(days=i) for i in range(5)]  # lun a vie</w:t>
+      </w:r>
+    </w:p>
+    <w:p>
+      <w:pPr>
+        <w:rPr>
+          <w:lang w:val="en-US"/>
+        </w:rPr>
+      </w:pPr>
+      <w:r>
+        <w:rPr>
+          <w:lang w:val="en-US"/>
+        </w:rPr>
+        <w:t xml:space="preserve">    laborables = [d for d in dias_semana </w:t>
+      </w:r>
+    </w:p>
+    <w:p>
+      <w:pPr>
+        <w:rPr>
+          <w:lang w:val="en-US"/>
+        </w:rPr>
+      </w:pPr>
+      <w:r>
+        <w:rPr>
+          <w:lang w:val="en-US"/>
+        </w:rPr>
+        <w:t xml:space="preserve">                  if d.weekday() &lt; 5 and d not in co_holidays]</w:t>
+      </w:r>
+    </w:p>
+    <w:p>
+      <w:pPr>
+        <w:rPr>
+          <w:lang w:val="en-US"/>
+        </w:rPr>
+      </w:pPr>
+      <w:r>
+        <w:rPr>
+          <w:lang w:val="en-US"/>
+        </w:rPr>
+        <w:t xml:space="preserve">    </w:t>
+      </w:r>
+    </w:p>
+    <w:p>
+      <w:r>
+        <w:rPr>
+          <w:lang w:val="en-US"/>
+        </w:rPr>
+        <w:t xml:space="preserve">    </w:t>
+      </w:r>
+      <w:r>
+        <w:t>if len(laborables) == 0:</w:t>
+      </w:r>
+    </w:p>
+    <w:p>
+      <w:r>
+        <w:t xml:space="preserve">        return 3  # semana sin días laborales (caso extremo)</w:t>
+      </w:r>
+    </w:p>
+    <w:p>
+      <w:r>
+        <w:t xml:space="preserve">    </w:t>
+      </w:r>
+    </w:p>
+    <w:p>
+      <w:r>
+        <w:t xml:space="preserve">    if fecha == laborables[0]:</w:t>
+      </w:r>
+    </w:p>
+    <w:p>
+      <w:r>
+        <w:t xml:space="preserve">        return 0  # primer día laboral</w:t>
+      </w:r>
+    </w:p>
+    <w:p>
+      <w:r>
+        <w:t xml:space="preserve">    elif fecha == laborables[-1]:</w:t>
+      </w:r>
+    </w:p>
+    <w:p>
+      <w:r>
+        <w:t xml:space="preserve">        return 2  # último día laboral</w:t>
+      </w:r>
+    </w:p>
+    <w:p>
+      <w:r>
+        <w:t xml:space="preserve">    else:</w:t>
+      </w:r>
+    </w:p>
+    <w:p>
+      <w:r>
+        <w:t xml:space="preserve">        return 1  # días intermedios</w:t>
+      </w:r>
+    </w:p>
+    <w:p/>
+    <w:p>
+      <w:r>
+        <w:t>df['tipo_dia'] = pd.to_datetime(df['tu_campo_fecha']).apply(tipo_dia)</w:t>
+      </w:r>
+    </w:p>
+    <w:p>
+      <w:r>
+        <w:br w:type="page"/>
+      </w:r>
+    </w:p>
+    <w:p>
+      <w:pPr>
+        <w:rPr>
+          <w:lang w:val="en-US"/>
+        </w:rPr>
+      </w:pPr>
+      <w:r>
+        <w:rPr>
+          <w:lang w:val="en-US"/>
+        </w:rPr>
+        <w:lastRenderedPageBreak/>
+        <w:t>import holidays</w:t>
+      </w:r>
+    </w:p>
+    <w:p>
+      <w:pPr>
+        <w:rPr>
+          <w:lang w:val="en-US"/>
+        </w:rPr>
+      </w:pPr>
+      <w:r>
+        <w:rPr>
+          <w:lang w:val="en-US"/>
+        </w:rPr>
+        <w:t>import pandas as pd</w:t>
+      </w:r>
+    </w:p>
+    <w:p>
+      <w:pPr>
+        <w:rPr>
+          <w:lang w:val="en-US"/>
+        </w:rPr>
+      </w:pPr>
+      <w:r>
+        <w:rPr>
+          <w:lang w:val="en-US"/>
+        </w:rPr>
+        <w:t>from datetime import date</w:t>
+      </w:r>
+    </w:p>
+    <w:p>
+      <w:pPr>
+        <w:rPr>
+          <w:lang w:val="en-US"/>
+        </w:rPr>
+      </w:pPr>
+    </w:p>
+    <w:p>
+      <w:pPr>
+        <w:rPr>
+          <w:lang w:val="en-US"/>
+        </w:rPr>
+      </w:pPr>
+      <w:r>
+        <w:rPr>
+          <w:lang w:val="en-US"/>
+        </w:rPr>
+        <w:t>co_holidays = holidays.Colombia(years=range(2024, 2026))</w:t>
+      </w:r>
+    </w:p>
+    <w:p>
+      <w:pPr>
+        <w:rPr>
+          <w:lang w:val="en-US"/>
+        </w:rPr>
+      </w:pPr>
+    </w:p>
+    <w:p>
+      <w:r>
+        <w:t>def tipo_dia(fecha):</w:t>
+      </w:r>
+    </w:p>
+    <w:p>
+      <w:r>
+        <w:t xml:space="preserve">    # Normalizar a datetime.date sin importar el tipo que llegue</w:t>
+      </w:r>
+    </w:p>
+    <w:p>
+      <w:pPr>
+        <w:rPr>
+          <w:lang w:val="en-US"/>
+        </w:rPr>
+      </w:pPr>
+      <w:r>
+        <w:t xml:space="preserve">    </w:t>
+      </w:r>
+      <w:r>
+        <w:rPr>
+          <w:lang w:val="en-US"/>
+        </w:rPr>
+        <w:t>if isinstance(fecha, pd.Timestamp):</w:t>
+      </w:r>
+    </w:p>
+    <w:p>
+      <w:r>
+        <w:rPr>
+          <w:lang w:val="en-US"/>
+        </w:rPr>
+        <w:t xml:space="preserve">        </w:t>
+      </w:r>
+      <w:r>
+        <w:t>fecha_date = fecha.date()</w:t>
+      </w:r>
+    </w:p>
+    <w:p>
+      <w:r>
+        <w:t xml:space="preserve">    else:</w:t>
+      </w:r>
+    </w:p>
+    <w:p>
+      <w:r>
+        <w:t xml:space="preserve">        fecha_date = pd.Timestamp(fecha).date()</w:t>
+      </w:r>
+    </w:p>
+    <w:p>
+      <w:r>
+        <w:t xml:space="preserve">    </w:t>
+      </w:r>
+    </w:p>
+    <w:p>
+      <w:r>
+        <w:t xml:space="preserve">    # Días no laborales</w:t>
+      </w:r>
+    </w:p>
+    <w:p>
+      <w:pPr>
+        <w:rPr>
+          <w:lang w:val="en-US"/>
+        </w:rPr>
+      </w:pPr>
+      <w:r>
+        <w:t xml:space="preserve">    </w:t>
+      </w:r>
+      <w:r>
+        <w:rPr>
+          <w:lang w:val="en-US"/>
+        </w:rPr>
+        <w:t>if fecha_date.weekday() &gt;= 5 or fecha_date in co_holidays:</w:t>
+      </w:r>
+    </w:p>
+    <w:p>
+      <w:r>
+        <w:rPr>
+          <w:lang w:val="en-US"/>
+        </w:rPr>
+        <w:t xml:space="preserve">        </w:t>
+      </w:r>
+      <w:r>
+        <w:t>return 3</w:t>
+      </w:r>
+    </w:p>
+    <w:p>
+      <w:r>
+        <w:t xml:space="preserve">    </w:t>
+      </w:r>
+    </w:p>
+    <w:p>
+      <w:r>
+        <w:t xml:space="preserve">    # Encontrar todos los días laborales de esa semana</w:t>
+      </w:r>
+    </w:p>
+    <w:p>
+      <w:pPr>
+        <w:rPr>
+          <w:lang w:val="en-US"/>
+        </w:rPr>
+      </w:pPr>
+      <w:r>
+        <w:t xml:space="preserve">    </w:t>
+      </w:r>
+      <w:r>
+        <w:rPr>
+          <w:lang w:val="en-US"/>
+        </w:rPr>
+        <w:t>lunes = fecha_date - pd.Timedelta(days=fecha_date.weekday())</w:t>
+      </w:r>
+    </w:p>
+    <w:p>
+      <w:pPr>
+        <w:rPr>
+          <w:lang w:val="en-US"/>
+        </w:rPr>
+      </w:pPr>
+      <w:r>
+        <w:rPr>
+          <w:lang w:val="en-US"/>
+        </w:rPr>
+        <w:t xml:space="preserve">    dias_semana = [lunes + pd.Timedelta(days=i) for i in range(5)]</w:t>
+      </w:r>
+    </w:p>
+    <w:p>
+      <w:pPr>
+        <w:rPr>
+          <w:lang w:val="en-US"/>
+        </w:rPr>
+      </w:pPr>
+      <w:r>
+        <w:rPr>
+          <w:lang w:val="en-US"/>
+        </w:rPr>
+        <w:t xml:space="preserve">    laborables = [</w:t>
+      </w:r>
+    </w:p>
+    <w:p>
+      <w:pPr>
+        <w:rPr>
+          <w:lang w:val="en-US"/>
+        </w:rPr>
+      </w:pPr>
+      <w:r>
+        <w:rPr>
+          <w:lang w:val="en-US"/>
+        </w:rPr>
+        <w:t xml:space="preserve">        d for d in dias_semana</w:t>
+      </w:r>
+    </w:p>
+    <w:p>
+      <w:pPr>
+        <w:rPr>
+          <w:lang w:val="en-US"/>
+        </w:rPr>
+      </w:pPr>
+      <w:r>
+        <w:rPr>
+          <w:lang w:val="en-US"/>
+        </w:rPr>
+        <w:t xml:space="preserve">        if d.weekday() &lt; 5 and d not in co_holidays</w:t>
+      </w:r>
+    </w:p>
+    <w:p>
+      <w:pPr>
+        <w:rPr>
+          <w:lang w:val="en-US"/>
+        </w:rPr>
+      </w:pPr>
+      <w:r>
+        <w:rPr>
+          <w:lang w:val="en-US"/>
+        </w:rPr>
+        <w:t xml:space="preserve">    ]</w:t>
+      </w:r>
+    </w:p>
+    <w:p>
+      <w:pPr>
+        <w:rPr>
+          <w:lang w:val="en-US"/>
+        </w:rPr>
+      </w:pPr>
+      <w:r>
+        <w:rPr>
+          <w:lang w:val="en-US"/>
+        </w:rPr>
+        <w:t xml:space="preserve">    </w:t>
+      </w:r>
+    </w:p>
+    <w:p>
+      <w:pPr>
+        <w:rPr>
+          <w:lang w:val="en-US"/>
+        </w:rPr>
+      </w:pPr>
+      <w:r>
+        <w:rPr>
+          <w:lang w:val="en-US"/>
+        </w:rPr>
+        <w:t xml:space="preserve">    if len(laborables) == 0:</w:t>
+      </w:r>
+    </w:p>
+    <w:p>
+      <w:pPr>
+        <w:rPr>
+          <w:lang w:val="en-US"/>
+        </w:rPr>
+      </w:pPr>
+      <w:r>
+        <w:rPr>
+          <w:lang w:val="en-US"/>
+        </w:rPr>
+        <w:t xml:space="preserve">        return 3</w:t>
+      </w:r>
+    </w:p>
+    <w:p>
+      <w:pPr>
+        <w:rPr>
+          <w:lang w:val="en-US"/>
+        </w:rPr>
+      </w:pPr>
+      <w:r>
+        <w:rPr>
+          <w:lang w:val="en-US"/>
+        </w:rPr>
+        <w:t xml:space="preserve">    </w:t>
+      </w:r>
+    </w:p>
+    <w:p>
+      <w:pPr>
+        <w:rPr>
+          <w:lang w:val="en-US"/>
+        </w:rPr>
+      </w:pPr>
+      <w:r>
+        <w:rPr>
+          <w:lang w:val="en-US"/>
+        </w:rPr>
+        <w:t xml:space="preserve">    if fecha_date == laborables[0]:</w:t>
+      </w:r>
+    </w:p>
+    <w:p>
+      <w:r>
+        <w:rPr>
+          <w:lang w:val="en-US"/>
+        </w:rPr>
+        <w:t xml:space="preserve">        </w:t>
+      </w:r>
+      <w:r>
+        <w:t>return 0  # primer día laboral</w:t>
+      </w:r>
+    </w:p>
+    <w:p>
+      <w:r>
+        <w:t xml:space="preserve">    elif fecha_date == laborables[-1]:</w:t>
+      </w:r>
+    </w:p>
+    <w:p>
+      <w:r>
+        <w:t xml:space="preserve">        return 2  # último día laboral</w:t>
+      </w:r>
+    </w:p>
+    <w:p>
+      <w:r>
+        <w:t xml:space="preserve">    else:</w:t>
+      </w:r>
+    </w:p>
+    <w:p>
+      <w:r>
+        <w:t xml:space="preserve">        return 1  # día intermedio</w:t>
+      </w:r>
+    </w:p>
+    <w:p/>
+    <w:p>
+      <w:r>
+        <w:t>df['tipo_dia'] = pd.to_datetime(df['tu_campo_fecha']).apply(tipo_dia)</w:t>
+      </w:r>
+    </w:p>
+    <w:p>
+      <w:r>
+        <w:br w:type="page"/>
+      </w:r>
+    </w:p>
+    <w:p>
+      <w:pPr>
+        <w:rPr>
+          <w:lang w:val="en-US"/>
+        </w:rPr>
+      </w:pPr>
+      <w:r>
+        <w:rPr>
+          <w:lang w:val="en-US"/>
+        </w:rPr>
+        <w:lastRenderedPageBreak/>
+        <w:t>import holidays</w:t>
+      </w:r>
+    </w:p>
+    <w:p>
+      <w:pPr>
+        <w:rPr>
+          <w:lang w:val="en-US"/>
+        </w:rPr>
+      </w:pPr>
+      <w:r>
+        <w:rPr>
+          <w:lang w:val="en-US"/>
+        </w:rPr>
+        <w:t>import pandas as pd</w:t>
+      </w:r>
+    </w:p>
+    <w:p>
+      <w:r>
+        <w:t>from datetime import timedelta</w:t>
+      </w:r>
+    </w:p>
+    <w:p/>
+    <w:p>
+      <w:r>
+        <w:t># Opción 1: ampliar el rango de años (más simple)</w:t>
+      </w:r>
+    </w:p>
+    <w:p>
+      <w:r>
+        <w:t>años = range(2020, 2030)  # ajusta según tus datos</w:t>
+      </w:r>
+    </w:p>
+    <w:p>
+      <w:r>
+        <w:t>co_festivos = holidays.Colombia(years=años)</w:t>
+      </w:r>
+    </w:p>
+    <w:p/>
+    <w:p>
+      <w:r>
+        <w:t>def tipo_dia(fecha):</w:t>
+      </w:r>
+    </w:p>
+    <w:p>
+      <w:r>
+        <w:t xml:space="preserve">    fecha_date = fecha.date() if isinstance(fecha, pd.Timestamp) else pd.Timestamp(fecha).date()</w:t>
+      </w:r>
+    </w:p>
+    <w:p>
+      <w:r>
+        <w:t xml:space="preserve">    </w:t>
+      </w:r>
+    </w:p>
+    <w:p>
+      <w:r>
+        <w:t xml:space="preserve">    # Opción 2: manejo seguro por si el año no está cubierto</w:t>
+      </w:r>
+    </w:p>
+    <w:p>
+      <w:pPr>
+        <w:rPr>
+          <w:lang w:val="en-US"/>
+        </w:rPr>
+      </w:pPr>
+      <w:r>
+        <w:t xml:space="preserve">    </w:t>
+      </w:r>
+      <w:r>
+        <w:rPr>
+          <w:lang w:val="en-US"/>
+        </w:rPr>
+        <w:t>try:</w:t>
+      </w:r>
+    </w:p>
+    <w:p>
+      <w:pPr>
+        <w:rPr>
+          <w:lang w:val="en-US"/>
+        </w:rPr>
+      </w:pPr>
+      <w:r>
+        <w:rPr>
+          <w:lang w:val="en-US"/>
+        </w:rPr>
+        <w:t xml:space="preserve">        es_festivo = fecha_date in co_festivos</w:t>
+      </w:r>
+    </w:p>
+    <w:p>
+      <w:pPr>
+        <w:rPr>
+          <w:lang w:val="en-US"/>
+        </w:rPr>
+      </w:pPr>
+      <w:r>
+        <w:rPr>
+          <w:lang w:val="en-US"/>
+        </w:rPr>
+        <w:t xml:space="preserve">    except Exception:</w:t>
+      </w:r>
+    </w:p>
+    <w:p>
+      <w:pPr>
+        <w:rPr>
+          <w:lang w:val="en-US"/>
+        </w:rPr>
+      </w:pPr>
+      <w:r>
+        <w:rPr>
+          <w:lang w:val="en-US"/>
+        </w:rPr>
+        <w:t xml:space="preserve">        es_festivo = False</w:t>
+      </w:r>
+    </w:p>
+    <w:p>
+      <w:pPr>
+        <w:rPr>
+          <w:lang w:val="en-US"/>
+        </w:rPr>
+      </w:pPr>
+      <w:r>
+        <w:rPr>
+          <w:lang w:val="en-US"/>
+        </w:rPr>
+        <w:t xml:space="preserve">    </w:t>
+      </w:r>
+    </w:p>
+    <w:p>
+      <w:pPr>
+        <w:rPr>
+          <w:lang w:val="en-US"/>
+        </w:rPr>
+      </w:pPr>
+      <w:r>
+        <w:rPr>
+          <w:lang w:val="en-US"/>
+        </w:rPr>
+        <w:t xml:space="preserve">    if fecha_date.weekday() &gt;= 5 or es_festivo:</w:t>
+      </w:r>
+    </w:p>
+    <w:p>
+      <w:pPr>
+        <w:rPr>
+          <w:lang w:val="en-US"/>
+        </w:rPr>
+      </w:pPr>
+      <w:r>
+        <w:rPr>
+          <w:lang w:val="en-US"/>
+        </w:rPr>
+        <w:t xml:space="preserve">        return 3</w:t>
+      </w:r>
+    </w:p>
+    <w:p>
+      <w:pPr>
+        <w:rPr>
+          <w:lang w:val="en-US"/>
+        </w:rPr>
+      </w:pPr>
+      <w:r>
+        <w:rPr>
+          <w:lang w:val="en-US"/>
+        </w:rPr>
+        <w:t xml:space="preserve">    </w:t>
+      </w:r>
+    </w:p>
+    <w:p>
+      <w:pPr>
+        <w:rPr>
+          <w:lang w:val="en-US"/>
+        </w:rPr>
+      </w:pPr>
+      <w:r>
+        <w:rPr>
+          <w:lang w:val="en-US"/>
+        </w:rPr>
+        <w:t xml:space="preserve">    lunes = fecha_date - timedelta(days=fecha_date.weekday())</w:t>
+      </w:r>
+    </w:p>
+    <w:p>
+      <w:pPr>
+        <w:rPr>
+          <w:lang w:val="en-US"/>
+        </w:rPr>
+      </w:pPr>
+      <w:r>
+        <w:rPr>
+          <w:lang w:val="en-US"/>
+        </w:rPr>
+        <w:t xml:space="preserve">    dias_semana = [lunes + timedelta(days=i) for i in range(5)]</w:t>
+      </w:r>
+    </w:p>
+    <w:p>
+      <w:pPr>
+        <w:rPr>
+          <w:lang w:val="en-US"/>
+        </w:rPr>
+      </w:pPr>
+      <w:r>
+        <w:rPr>
+          <w:lang w:val="en-US"/>
+        </w:rPr>
+        <w:t xml:space="preserve">    </w:t>
+      </w:r>
+    </w:p>
+    <w:p>
+      <w:pPr>
+        <w:rPr>
+          <w:lang w:val="en-US"/>
+        </w:rPr>
+      </w:pPr>
+      <w:r>
+        <w:rPr>
+          <w:lang w:val="en-US"/>
+        </w:rPr>
+        <w:t xml:space="preserve">    try:</w:t>
+      </w:r>
+    </w:p>
+    <w:p>
+      <w:pPr>
+        <w:rPr>
+          <w:lang w:val="en-US"/>
+        </w:rPr>
+      </w:pPr>
+      <w:r>
+        <w:rPr>
+          <w:lang w:val="en-US"/>
+        </w:rPr>
+        <w:t xml:space="preserve">        laborables = [d for d in dias_semana if d.weekday() &lt; 5 and d not in co_festivos]</w:t>
+      </w:r>
+    </w:p>
+    <w:p>
+      <w:pPr>
+        <w:rPr>
+          <w:lang w:val="en-US"/>
+        </w:rPr>
+      </w:pPr>
+      <w:r>
+        <w:rPr>
+          <w:lang w:val="en-US"/>
+        </w:rPr>
+        <w:t xml:space="preserve">    except Exception:</w:t>
+      </w:r>
+    </w:p>
+    <w:p>
+      <w:pPr>
+        <w:rPr>
+          <w:lang w:val="en-US"/>
+        </w:rPr>
+      </w:pPr>
+      <w:r>
+        <w:rPr>
+          <w:lang w:val="en-US"/>
+        </w:rPr>
+        <w:t xml:space="preserve">        laborables = [d for d in dias_semana if d.weekday() &lt; 5]</w:t>
+      </w:r>
+    </w:p>
+    <w:p>
+      <w:pPr>
+        <w:rPr>
+          <w:lang w:val="en-US"/>
+        </w:rPr>
+      </w:pPr>
+      <w:r>
+        <w:rPr>
+          <w:lang w:val="en-US"/>
+        </w:rPr>
+        <w:t xml:space="preserve">    </w:t>
+      </w:r>
+    </w:p>
+    <w:p>
+      <w:pPr>
+        <w:rPr>
+          <w:lang w:val="en-US"/>
+        </w:rPr>
+      </w:pPr>
+      <w:r>
+        <w:rPr>
+          <w:lang w:val="en-US"/>
+        </w:rPr>
+        <w:t xml:space="preserve">    if len(laborables) == 0:</w:t>
+      </w:r>
+    </w:p>
+    <w:p>
+      <w:pPr>
+        <w:rPr>
+          <w:lang w:val="en-US"/>
+        </w:rPr>
+      </w:pPr>
+      <w:r>
+        <w:rPr>
+          <w:lang w:val="en-US"/>
+        </w:rPr>
+        <w:t xml:space="preserve">        return 3</w:t>
+      </w:r>
+    </w:p>
+    <w:p>
+      <w:pPr>
+        <w:rPr>
+          <w:lang w:val="en-US"/>
+        </w:rPr>
+      </w:pPr>
+      <w:r>
+        <w:rPr>
+          <w:lang w:val="en-US"/>
+        </w:rPr>
+        <w:t xml:space="preserve">    if fecha_date == laborables[0]:</w:t>
+      </w:r>
+    </w:p>
+    <w:p>
+      <w:pPr>
+        <w:rPr>
+          <w:lang w:val="en-US"/>
+        </w:rPr>
+      </w:pPr>
+      <w:r>
+        <w:rPr>
+          <w:lang w:val="en-US"/>
+        </w:rPr>
+        <w:t xml:space="preserve">        return 0</w:t>
+      </w:r>
+    </w:p>
+    <w:p>
+      <w:pPr>
+        <w:rPr>
+          <w:lang w:val="en-US"/>
+        </w:rPr>
+      </w:pPr>
+      <w:r>
+        <w:rPr>
+          <w:lang w:val="en-US"/>
+        </w:rPr>
+        <w:t xml:space="preserve">    elif fecha_date == laborables[-1]:</w:t>
+      </w:r>
+    </w:p>
+    <w:p>
+      <w:pPr>
+        <w:rPr>
+          <w:lang w:val="en-US"/>
+        </w:rPr>
+      </w:pPr>
+      <w:r>
+        <w:rPr>
+          <w:lang w:val="en-US"/>
+        </w:rPr>
+        <w:t xml:space="preserve">        return 2</w:t>
+      </w:r>
+    </w:p>
+    <w:p>
+      <w:r>
+        <w:rPr>
+          <w:lang w:val="en-US"/>
+        </w:rPr>
+        <w:t xml:space="preserve">    </w:t>
+      </w:r>
+      <w:r>
+        <w:t>else:</w:t>
+      </w:r>
+    </w:p>
+    <w:p>
+      <w:r>
+        <w:t xml:space="preserve">        return 1</w:t>
+      </w:r>
+    </w:p>
+    <w:p/>
+    <w:p>
+      <w:r>
+        <w:t>df['Tipo dia'] = pd.to_datetime(df['Fecha Salida']).apply(tipo_dia)</w:t>
+      </w:r>
+      <w:r>
+        <w:br w:type="page"/>
+      </w:r>
+    </w:p>
+    <w:p>
+      <w:r>
+        <w:lastRenderedPageBreak/>
+        <w:t>1. C_total = media de toda la muestra</w:t>
+      </w:r>
+    </w:p>
+    <w:p>
+      <w:r>
+        <w:t xml:space="preserve">           → parte en mitad_inf y mitad_sup</w:t>
+      </w:r>
+    </w:p>
+    <w:p/>
+    <w:p>
+      <w:r>
+        <w:t>2. c1 = media(mitad_inf)</w:t>
+      </w:r>
+    </w:p>
+    <w:p>
+      <w:r>
+        <w:t xml:space="preserve">   c2 = media(mitad_sup)</w:t>
+      </w:r>
+    </w:p>
+    <w:p>
+      <w:r>
+        <w:t xml:space="preserve">           → genera 4 secciones</w:t>
+      </w:r>
+    </w:p>
+    <w:p/>
+    <w:p>
+      <w:r>
+        <w:t>3. Calcular varianza de cada sección</w:t>
+      </w:r>
+    </w:p>
+    <w:p>
+      <w:r>
+        <w:t xml:space="preserve">   → partir la de MAYOR varianza por su media</w:t>
+      </w:r>
+    </w:p>
+    <w:p>
+      <w:pPr>
+        <w:rPr>
+          <w:lang w:val="en-US"/>
+        </w:rPr>
+      </w:pPr>
+      <w:r>
+        <w:t xml:space="preserve">           </w:t>
+      </w:r>
+      <w:r>
+        <w:rPr>
+          <w:lang w:val="en-US"/>
+        </w:rPr>
+        <w:t>→ genera el 5to centroide</w:t>
+      </w:r>
+    </w:p>
+    <w:p>
+      <w:pPr>
+        <w:rPr>
+          <w:lang w:val="en-US"/>
+        </w:rPr>
+      </w:pPr>
+    </w:p>
+    <w:p>
+      <w:pPr>
+        <w:rPr>
+          <w:lang w:val="en-US"/>
+        </w:rPr>
+      </w:pPr>
+      <w:r>
+        <w:rPr>
+          <w:lang w:val="en-US"/>
+        </w:rPr>
+        <w:t>Código</w:t>
+      </w:r>
+    </w:p>
+    <w:p>
+      <w:pPr>
+        <w:rPr>
+          <w:lang w:val="en-US"/>
+        </w:rPr>
+      </w:pPr>
+    </w:p>
+    <w:p>
+      <w:pPr>
+        <w:rPr>
+          <w:lang w:val="en-US"/>
+        </w:rPr>
+      </w:pPr>
+    </w:p>
+    <w:p>
+      <w:pPr>
+        <w:rPr>
+          <w:lang w:val="en-US"/>
+        </w:rPr>
+      </w:pPr>
+      <w:r>
+        <w:rPr>
+          <w:lang w:val="en-US"/>
+        </w:rPr>
+        <w:t>import numpy as np</w:t>
+      </w:r>
+    </w:p>
+    <w:p>
+      <w:pPr>
+        <w:rPr>
+          <w:lang w:val="en-US"/>
+        </w:rPr>
+      </w:pPr>
+      <w:r>
+        <w:rPr>
+          <w:lang w:val="en-US"/>
+        </w:rPr>
+        <w:t>from sklearn.cluster import KMeans</w:t>
+      </w:r>
+    </w:p>
+    <w:p>
+      <w:pPr>
+        <w:rPr>
+          <w:lang w:val="en-US"/>
+        </w:rPr>
+      </w:pPr>
+    </w:p>
+    <w:p>
+      <w:pPr>
+        <w:rPr>
+          <w:lang w:val="en-US"/>
+        </w:rPr>
+      </w:pPr>
+      <w:r>
+        <w:rPr>
+          <w:lang w:val="en-US"/>
+        </w:rPr>
+        <w:t>x = df[['variable_independiente']].values</w:t>
+      </w:r>
+    </w:p>
+    <w:p>
+      <w:pPr>
+        <w:rPr>
+          <w:lang w:val="en-US"/>
+        </w:rPr>
+      </w:pPr>
+      <w:r>
+        <w:rPr>
+          <w:lang w:val="en-US"/>
+        </w:rPr>
+        <w:t>x_flat = x.flatten()</w:t>
+      </w:r>
+    </w:p>
+    <w:p>
+      <w:pPr>
+        <w:rPr>
+          <w:lang w:val="en-US"/>
+        </w:rPr>
+      </w:pPr>
+    </w:p>
+    <w:p>
+      <w:pPr>
+        <w:rPr>
+          <w:lang w:val="en-US"/>
+        </w:rPr>
+      </w:pPr>
+      <w:r>
+        <w:rPr>
+          <w:lang w:val="en-US"/>
+        </w:rPr>
+        <w:t># --- Paso 1: centroide global ---</w:t>
+      </w:r>
+    </w:p>
+    <w:p>
+      <w:pPr>
+        <w:rPr>
+          <w:lang w:val="en-US"/>
+        </w:rPr>
+      </w:pPr>
+      <w:r>
+        <w:rPr>
+          <w:lang w:val="en-US"/>
+        </w:rPr>
+        <w:t>c_total = x_flat.mean()</w:t>
+      </w:r>
+    </w:p>
+    <w:p>
+      <w:pPr>
+        <w:rPr>
+          <w:lang w:val="en-US"/>
+        </w:rPr>
+      </w:pPr>
+      <w:r>
+        <w:rPr>
+          <w:lang w:val="en-US"/>
+        </w:rPr>
+        <w:t>mitad_inf = x_flat[x_flat &lt; c_total]</w:t>
+      </w:r>
+    </w:p>
+    <w:p>
+      <w:pPr>
+        <w:rPr>
+          <w:lang w:val="en-US"/>
+        </w:rPr>
+      </w:pPr>
+      <w:r>
+        <w:rPr>
+          <w:lang w:val="en-US"/>
+        </w:rPr>
+        <w:t>mitad_sup = x_flat[x_flat &gt;= c_total]</w:t>
+      </w:r>
+    </w:p>
+    <w:p>
+      <w:pPr>
+        <w:rPr>
+          <w:lang w:val="en-US"/>
+        </w:rPr>
+      </w:pPr>
+    </w:p>
+    <w:p>
+      <w:r>
+        <w:t># --- Paso 2: centroide de cada mitad ---</w:t>
+      </w:r>
+    </w:p>
+    <w:p>
+      <w:r>
+        <w:t>c1 = mitad_inf.mean()</w:t>
+      </w:r>
+    </w:p>
+    <w:p>
+      <w:r>
+        <w:t>c2 = mitad_sup.mean()</w:t>
+      </w:r>
+    </w:p>
+    <w:p/>
+    <w:p>
+      <w:r>
+        <w:t># --- Paso 3: definir las 4 secciones ---</w:t>
+      </w:r>
+    </w:p>
+    <w:p>
+      <w:r>
+        <w:t>secciones = [</w:t>
+      </w:r>
+    </w:p>
+    <w:p>
+      <w:pPr>
+        <w:rPr>
+          <w:lang w:val="en-US"/>
+        </w:rPr>
+      </w:pPr>
+      <w:r>
+        <w:t xml:space="preserve">    </w:t>
+      </w:r>
+      <w:r>
+        <w:rPr>
+          <w:lang w:val="en-US"/>
+        </w:rPr>
+        <w:t>x_flat[(x_flat &gt;= x_flat.min()) &amp; (x_flat &lt; c1)],</w:t>
+      </w:r>
+    </w:p>
+    <w:p>
+      <w:pPr>
+        <w:rPr>
+          <w:lang w:val="en-US"/>
+        </w:rPr>
+      </w:pPr>
+      <w:r>
+        <w:rPr>
+          <w:lang w:val="en-US"/>
+        </w:rPr>
+        <w:t xml:space="preserve">    x_flat[(x_flat &gt;= c1)           &amp; (x_flat &lt; c_total)],</w:t>
+      </w:r>
+    </w:p>
+    <w:p>
+      <w:pPr>
+        <w:rPr>
+          <w:lang w:val="en-US"/>
+        </w:rPr>
+      </w:pPr>
+      <w:r>
+        <w:rPr>
+          <w:lang w:val="en-US"/>
+        </w:rPr>
+        <w:t xml:space="preserve">    x_flat[(x_flat &gt;= c_total)      &amp; (x_flat &lt; c2)],</w:t>
+      </w:r>
+    </w:p>
+    <w:p>
+      <w:pPr>
+        <w:rPr>
+          <w:lang w:val="en-US"/>
+        </w:rPr>
+      </w:pPr>
+      <w:r>
+        <w:rPr>
+          <w:lang w:val="en-US"/>
+        </w:rPr>
+        <w:t xml:space="preserve">    x_flat[(x_flat &gt;= c2)           &amp; (x_flat &lt;= x_flat.max())]</w:t>
+      </w:r>
+    </w:p>
+    <w:p>
+      <w:r>
+        <w:t>]</w:t>
+      </w:r>
+    </w:p>
+    <w:p/>
+    <w:p>
+      <w:r>
+        <w:t># --- Paso 4: partir la sección de mayor varianza ---</w:t>
+      </w:r>
+    </w:p>
+    <w:p>
+      <w:r>
+        <w:t>varianzas = [s.var() for s in secciones]</w:t>
+      </w:r>
+    </w:p>
+    <w:p>
+      <w:r>
+        <w:t>idx_max = np.argmax(varianzas)</w:t>
+      </w:r>
+    </w:p>
+    <w:p>
+      <w:r>
+        <w:t>seccion_a_partir = secciones[idx_max]</w:t>
+      </w:r>
+    </w:p>
+    <w:p>
+      <w:r>
+        <w:t>print(f"Sección con mayor varianza: {idx_max + 1} (var = {varianzas[idx_max]:.4f})")</w:t>
+      </w:r>
+    </w:p>
+    <w:p/>
+    <w:p>
+      <w:r>
+        <w:t># Bisectar esa sección por su propia media</w:t>
+      </w:r>
+    </w:p>
+    <w:p>
+      <w:r>
+        <w:lastRenderedPageBreak/>
+        <w:t>c_nuevo = seccion_a_partir.mean()</w:t>
+      </w:r>
+    </w:p>
+    <w:p>
+      <w:r>
+        <w:t>sub_inf = seccion_a_partir[seccion_a_partir &lt; c_nuevo]</w:t>
+      </w:r>
+    </w:p>
+    <w:p>
+      <w:r>
+        <w:t>sub_sup = seccion_a_partir[seccion_a_partir &gt;= c_nuevo]</w:t>
+      </w:r>
+    </w:p>
+    <w:p/>
+    <w:p>
+      <w:r>
+        <w:t># Reemplazar esa sección por las dos subsecciones</w:t>
+      </w:r>
+    </w:p>
+    <w:p>
+      <w:r>
+        <w:t>secciones_finales = secciones.copy()</w:t>
+      </w:r>
+    </w:p>
+    <w:p>
+      <w:r>
+        <w:t>secciones_finales.pop(idx_max)</w:t>
+      </w:r>
+    </w:p>
+    <w:p>
+      <w:r>
+        <w:t>secciones_finales.insert(idx_max,     sub_inf)</w:t>
+      </w:r>
+    </w:p>
+    <w:p>
+      <w:r>
+        <w:t>secciones_finales.insert(idx_max + 1, sub_sup)</w:t>
+      </w:r>
+    </w:p>
+    <w:p/>
+    <w:p>
+      <w:r>
+        <w:t># --- Paso 5: centroide de cada sección final ---</w:t>
+      </w:r>
+    </w:p>
+    <w:p>
+      <w:pPr>
+        <w:rPr>
+          <w:lang w:val="en-US"/>
+        </w:rPr>
+      </w:pPr>
+      <w:r>
+        <w:rPr>
+          <w:lang w:val="en-US"/>
+        </w:rPr>
+        <w:t>centroides_iniciales = np.array(</w:t>
+      </w:r>
+    </w:p>
+    <w:p>
+      <w:pPr>
+        <w:rPr>
+          <w:lang w:val="en-US"/>
+        </w:rPr>
+      </w:pPr>
+      <w:r>
+        <w:rPr>
+          <w:lang w:val="en-US"/>
+        </w:rPr>
+        <w:t xml:space="preserve">    [s.mean() for s in secciones_finales]</w:t>
+      </w:r>
+    </w:p>
+    <w:p>
+      <w:pPr>
+        <w:rPr>
+          <w:lang w:val="en-US"/>
+        </w:rPr>
+      </w:pPr>
+      <w:r>
+        <w:rPr>
+          <w:lang w:val="en-US"/>
+        </w:rPr>
+        <w:t>).reshape(-1, 1)</w:t>
+      </w:r>
+    </w:p>
+    <w:p>
+      <w:pPr>
+        <w:rPr>
+          <w:lang w:val="en-US"/>
+        </w:rPr>
+      </w:pPr>
+    </w:p>
+    <w:p>
+      <w:pPr>
+        <w:rPr>
+          <w:lang w:val="en-US"/>
+        </w:rPr>
+      </w:pPr>
+      <w:r>
+        <w:rPr>
+          <w:lang w:val="en-US"/>
+        </w:rPr>
+        <w:t>print("Centroides iniciales:\n", centroides_iniciales)</w:t>
+      </w:r>
+    </w:p>
+    <w:p>
+      <w:pPr>
+        <w:rPr>
+          <w:lang w:val="en-US"/>
+        </w:rPr>
+      </w:pPr>
+    </w:p>
+    <w:p>
+      <w:pPr>
+        <w:rPr>
+          <w:lang w:val="en-US"/>
+        </w:rPr>
+      </w:pPr>
+      <w:r>
+        <w:rPr>
+          <w:lang w:val="en-US"/>
+        </w:rPr>
+        <w:t># --- KMeans con esos centroides ---</w:t>
+      </w:r>
+    </w:p>
+    <w:p>
+      <w:pPr>
+        <w:rPr>
+          <w:lang w:val="en-US"/>
+        </w:rPr>
+      </w:pPr>
+      <w:r>
+        <w:rPr>
+          <w:lang w:val="en-US"/>
+        </w:rPr>
+        <w:t>kmeans = KMeans(</w:t>
+      </w:r>
+    </w:p>
+    <w:p>
+      <w:pPr>
+        <w:rPr>
+          <w:lang w:val="en-US"/>
+        </w:rPr>
+      </w:pPr>
+      <w:r>
+        <w:rPr>
+          <w:lang w:val="en-US"/>
+        </w:rPr>
+        <w:t xml:space="preserve">    n_clusters=5,</w:t>
+      </w:r>
+    </w:p>
+    <w:p>
+      <w:pPr>
+        <w:rPr>
+          <w:lang w:val="en-US"/>
+        </w:rPr>
+      </w:pPr>
+      <w:r>
+        <w:rPr>
+          <w:lang w:val="en-US"/>
+        </w:rPr>
+        <w:t xml:space="preserve">    init=centroides_iniciales,</w:t>
+      </w:r>
+    </w:p>
+    <w:p>
+      <w:pPr>
+        <w:rPr>
+          <w:lang w:val="en-US"/>
+        </w:rPr>
+      </w:pPr>
+      <w:r>
+        <w:rPr>
+          <w:lang w:val="en-US"/>
+        </w:rPr>
+        <w:t xml:space="preserve">    n_init=1,</w:t>
+      </w:r>
+    </w:p>
+    <w:p>
+      <w:pPr>
+        <w:rPr>
+          <w:lang w:val="en-US"/>
+        </w:rPr>
+      </w:pPr>
+      <w:r>
+        <w:rPr>
+          <w:lang w:val="en-US"/>
+        </w:rPr>
+        <w:t xml:space="preserve">    random_state=42</w:t>
+      </w:r>
+    </w:p>
+    <w:p>
+      <w:pPr>
+        <w:rPr>
+          <w:lang w:val="en-US"/>
+        </w:rPr>
+      </w:pPr>
+      <w:r>
+        <w:rPr>
+          <w:lang w:val="en-US"/>
+        </w:rPr>
+        <w:t>)</w:t>
+      </w:r>
+    </w:p>
+    <w:p>
+      <w:pPr>
+        <w:rPr>
+          <w:lang w:val="en-US"/>
+        </w:rPr>
+      </w:pPr>
+    </w:p>
+    <w:p>
+      <w:pPr>
+        <w:rPr>
+          <w:lang w:val="en-US"/>
+        </w:rPr>
+      </w:pPr>
+      <w:r>
+        <w:rPr>
+          <w:lang w:val="en-US"/>
+        </w:rPr>
+        <w:t>kmeans.fit(x)</w:t>
+      </w:r>
+    </w:p>
+    <w:p>
+      <w:pPr>
+        <w:rPr>
+          <w:lang w:val="en-US"/>
+        </w:rPr>
+      </w:pPr>
+      <w:r>
+        <w:rPr>
+          <w:lang w:val="en-US"/>
+        </w:rPr>
+        <w:t>df['cluster'] = kmeans.labels_</w:t>
+      </w:r>
+    </w:p>
+    <w:p>
+      <w:pPr>
+        <w:rPr>
+          <w:lang w:val="en-US"/>
+        </w:rPr>
+      </w:pPr>
+      <w:r>
+        <w:rPr>
+          <w:lang w:val="en-US"/>
+        </w:rPr>
+        <w:br w:type="page"/>
+      </w:r>
+    </w:p>
+    <w:p>
+      <w:pPr>
+        <w:rPr>
+          <w:lang w:val="en-US"/>
+        </w:rPr>
+      </w:pPr>
+      <w:r>
+        <w:rPr>
+          <w:lang w:val="en-US"/>
+        </w:rPr>
+        <w:lastRenderedPageBreak/>
+        <w:t># 1. Obtener los centroides</w:t>
+      </w:r>
+    </w:p>
+    <w:p>
+      <w:pPr>
+        <w:rPr>
+          <w:lang w:val="en-US"/>
+        </w:rPr>
+      </w:pPr>
+      <w:r>
+        <w:rPr>
+          <w:lang w:val="en-US"/>
+        </w:rPr>
+        <w:t>centroides = kmeans.cluster_centers_  # shape (n_clusters, 1)</w:t>
+      </w:r>
+    </w:p>
+    <w:p>
+      <w:pPr>
+        <w:rPr>
+          <w:lang w:val="en-US"/>
+        </w:rPr>
+      </w:pPr>
+    </w:p>
+    <w:p>
+      <w:r>
+        <w:t># 2. Para cada centroide, buscar su probabilidad en la tabla de frecuencias acumuladas</w:t>
+      </w:r>
+    </w:p>
+    <w:p>
+      <w:r>
+        <w:t>#    Suponiendo que df_freq tiene columnas 'valor' y 'prob_acumulada'</w:t>
+      </w:r>
+    </w:p>
+    <w:p>
+      <w:r>
+        <w:t>def buscar_probabilidad(centroide, df_freq):</w:t>
+      </w:r>
+    </w:p>
+    <w:p>
+      <w:r>
+        <w:t xml:space="preserve">    # Busca el valor más cercano al centroide en la tabla</w:t>
+      </w:r>
+    </w:p>
+    <w:p>
+      <w:r>
+        <w:t xml:space="preserve">    idx = (df_freq['valor'] - centroide).abs().idxmin()</w:t>
+      </w:r>
+    </w:p>
+    <w:p>
+      <w:r>
+        <w:t xml:space="preserve">    return df_freq.loc[idx, 'prob_acumulada']</w:t>
+      </w:r>
+    </w:p>
+    <w:p/>
+    <w:p>
+      <w:r>
+        <w:t># 3. Construir el vector (centroide, probabilidad) para cada cluster</w:t>
+      </w:r>
+    </w:p>
+    <w:p>
+      <w:pPr>
+        <w:rPr>
+          <w:lang w:val="en-US"/>
+        </w:rPr>
+      </w:pPr>
+      <w:r>
+        <w:rPr>
+          <w:lang w:val="en-US"/>
+        </w:rPr>
+        <w:t>vectores = []</w:t>
+      </w:r>
+    </w:p>
+    <w:p>
+      <w:pPr>
+        <w:rPr>
+          <w:lang w:val="en-US"/>
+        </w:rPr>
+      </w:pPr>
+      <w:r>
+        <w:rPr>
+          <w:lang w:val="en-US"/>
+        </w:rPr>
+        <w:t>for i, centroide in enumerate(centroides):</w:t>
+      </w:r>
+    </w:p>
+    <w:p>
+      <w:r>
+        <w:rPr>
+          <w:lang w:val="en-US"/>
+        </w:rPr>
+        <w:t xml:space="preserve">    </w:t>
+      </w:r>
+      <w:r>
+        <w:t>valor = centroide[0]  # X tiene una sola columna</w:t>
+      </w:r>
+    </w:p>
+    <w:p>
+      <w:r>
+        <w:t xml:space="preserve">    prob = buscar_probabilidad(valor, df_freq)</w:t>
+      </w:r>
+    </w:p>
+    <w:p>
+      <w:r>
+        <w:t xml:space="preserve">    vectores.append([valor, prob])</w:t>
+      </w:r>
+    </w:p>
+    <w:p/>
+    <w:p>
+      <w:r>
+        <w:t>vectores = np.array(vectores)</w:t>
+      </w:r>
+    </w:p>
+    <w:p>
+      <w:r>
+        <w:t>print(vectores)</w:t>
+      </w:r>
+    </w:p>
+    <w:p>
+      <w:r>
+        <w:t># Ej: [[2500.0, 0.35]</w:t>
+      </w:r>
+    </w:p>
+    <w:p>
+      <w:r>
+        <w:t>#       [5000.0, 0.85]]</w:t>
+      </w:r>
+    </w:p>
+    <w:p/>
+    <w:p>
+      <w:r>
+        <w:t># 4. Comparar con similitud de cosenos</w:t>
+      </w:r>
+    </w:p>
+    <w:p>
+      <w:pPr>
+        <w:rPr>
+          <w:lang w:val="en-US"/>
+        </w:rPr>
+      </w:pPr>
+      <w:r>
+        <w:rPr>
+          <w:lang w:val="en-US"/>
+        </w:rPr>
+        <w:t>from sklearn.metrics.pairwise import cosine_similarity</w:t>
+      </w:r>
+    </w:p>
+    <w:p>
+      <w:pPr>
+        <w:rPr>
+          <w:lang w:val="en-US"/>
+        </w:rPr>
+      </w:pPr>
+    </w:p>
+    <w:p>
+      <w:pPr>
+        <w:rPr>
+          <w:lang w:val="en-US"/>
+        </w:rPr>
+      </w:pPr>
+      <w:r>
+        <w:rPr>
+          <w:lang w:val="en-US"/>
+        </w:rPr>
+        <w:t>similitud = cosine_similarity(vectores)</w:t>
+      </w:r>
+    </w:p>
+    <w:p>
+      <w:pPr>
+        <w:rPr>
+          <w:lang w:val="es-ES_tradnl"/>
+        </w:rPr>
+      </w:pPr>
+      <w:r>
+        <w:rPr>
+          <w:lang w:val="en-US"/>
+        </w:rPr>
+        <w:t>print(similitud)</w:t>
+      </w:r>
+    </w:p>
+    <w:p>
+      <w:pPr>
+        <w:rPr>
+          <w:lang w:val="es-ES_tradnl"/>
+        </w:rPr>
+      </w:pPr>
+      <w:r>
+        <w:rPr>
+          <w:lang w:val="es-ES_tradnl"/>
+        </w:rPr>
+        <w:br w:type="page"/>
+      </w:r>
+    </w:p>
+    <w:p>
+      <w:pPr>
+        <w:rPr>
+          <w:lang w:val="en-US"/>
+        </w:rPr>
+      </w:pPr>
+      <w:r>
+        <w:rPr>
+          <w:lang w:val="en-US"/>
+        </w:rPr>
+        <w:lastRenderedPageBreak/>
+        <w:t>import matplotlib.pyplot as plt</w:t>
+      </w:r>
+    </w:p>
+    <w:p>
+      <w:pPr>
+        <w:rPr>
+          <w:lang w:val="en-US"/>
+        </w:rPr>
+      </w:pPr>
+    </w:p>
+    <w:p>
+      <w:pPr>
+        <w:rPr>
+          <w:lang w:val="en-US"/>
+        </w:rPr>
+      </w:pPr>
+      <w:r>
+        <w:rPr>
+          <w:lang w:val="en-US"/>
+        </w:rPr>
+        <w:t>df.boxplot(column='salario', by='cluster')</w:t>
+      </w:r>
+    </w:p>
+    <w:p>
+      <w:r>
+        <w:t>plt.title('Distribución por cluster')</w:t>
+      </w:r>
+    </w:p>
+    <w:p>
+      <w:pPr>
+        <w:rPr>
+          <w:lang w:val="en-US"/>
+        </w:rPr>
+      </w:pPr>
+      <w:r>
+        <w:rPr>
+          <w:lang w:val="en-US"/>
+        </w:rPr>
+        <w:t>plt.suptitle('')</w:t>
+      </w:r>
+    </w:p>
+    <w:p>
+      <w:pPr>
+        <w:rPr>
+          <w:lang w:val="en-US"/>
+        </w:rPr>
+      </w:pPr>
+      <w:r>
+        <w:rPr>
+          <w:lang w:val="en-US"/>
+        </w:rPr>
+        <w:t>plt.xlabel('Cluster')</w:t>
+      </w:r>
+    </w:p>
+    <w:p>
+      <w:pPr>
+        <w:rPr>
+          <w:lang w:val="en-US"/>
+        </w:rPr>
+      </w:pPr>
+      <w:r>
+        <w:rPr>
+          <w:lang w:val="en-US"/>
+        </w:rPr>
+        <w:t>plt.ylabel('Salario')</w:t>
+      </w:r>
+    </w:p>
+    <w:p>
+      <w:pPr>
+        <w:rPr>
+          <w:lang w:val="en-US"/>
+        </w:rPr>
+      </w:pPr>
+      <w:r>
+        <w:rPr>
+          <w:lang w:val="en-US"/>
+        </w:rPr>
+        <w:t>plt.show()</w:t>
+      </w:r>
+    </w:p>
+    <w:p>
+      <w:pPr>
+        <w:rPr>
+          <w:lang w:val="en-US"/>
+        </w:rPr>
+      </w:pPr>
+    </w:p>
+    <w:p>
+      <w:pPr>
+        <w:rPr>
+          <w:lang w:val="en-US"/>
+        </w:rPr>
+      </w:pPr>
+      <w:r>
+        <w:rPr>
+          <w:lang w:val="en-US"/>
+        </w:rPr>
+        <w:t>resumen = df.groupby('cluster')['salario'].agg(['mean', 'std'])</w:t>
+      </w:r>
+    </w:p>
+    <w:p>
+      <w:pPr>
+        <w:rPr>
+          <w:lang w:val="en-US"/>
+        </w:rPr>
+      </w:pPr>
+    </w:p>
+    <w:p>
+      <w:pPr>
+        <w:rPr>
+          <w:lang w:val="en-US"/>
+        </w:rPr>
+      </w:pPr>
+      <w:r>
+        <w:rPr>
+          <w:lang w:val="en-US"/>
+        </w:rPr>
+        <w:t>resumen['mean'].plot(kind='bar', yerr=resumen['std'], capsize=5)</w:t>
+      </w:r>
+    </w:p>
+    <w:p>
+      <w:r>
+        <w:t>plt.title('Media por cluster')</w:t>
+      </w:r>
+    </w:p>
+    <w:p>
+      <w:pPr>
+        <w:rPr>
+          <w:lang w:val="en-US"/>
+        </w:rPr>
+      </w:pPr>
+      <w:r>
+        <w:rPr>
+          <w:lang w:val="en-US"/>
+        </w:rPr>
+        <w:t>plt.xlabel('Cluster')</w:t>
+      </w:r>
+    </w:p>
+    <w:p>
+      <w:pPr>
+        <w:rPr>
+          <w:lang w:val="en-US"/>
+        </w:rPr>
+      </w:pPr>
+      <w:r>
+        <w:rPr>
+          <w:lang w:val="en-US"/>
+        </w:rPr>
+        <w:t>plt.ylabel('Salario')</w:t>
+      </w:r>
+    </w:p>
+    <w:p>
+      <w:pPr>
+        <w:rPr>
+          <w:lang w:val="en-US"/>
+        </w:rPr>
+      </w:pPr>
+      <w:r>
+        <w:rPr>
+          <w:lang w:val="en-US"/>
+        </w:rPr>
+        <w:t>plt.xticks(rotation=0)</w:t>
+      </w:r>
+    </w:p>
+    <w:p>
+      <w:pPr>
+        <w:rPr>
+          <w:lang w:val="en-US"/>
+        </w:rPr>
+      </w:pPr>
+      <w:r>
+        <w:rPr>
+          <w:lang w:val="en-US"/>
+        </w:rPr>
+        <w:t>plt.show()</w:t>
+      </w:r>
+    </w:p>
+    <w:p>
+      <w:pPr>
+        <w:rPr>
+          <w:lang w:val="en-US"/>
+        </w:rPr>
+      </w:pPr>
+    </w:p>
+    <w:p>
+      <w:pPr>
+        <w:rPr>
+          <w:lang w:val="en-US"/>
+        </w:rPr>
+      </w:pPr>
+      <w:r>
+        <w:rPr>
+          <w:lang w:val="en-US"/>
+        </w:rPr>
+        <w:t>import seaborn as sns</w:t>
+      </w:r>
+    </w:p>
+    <w:p>
+      <w:pPr>
+        <w:rPr>
+          <w:lang w:val="en-US"/>
+        </w:rPr>
+      </w:pPr>
+    </w:p>
+    <w:p>
+      <w:pPr>
+        <w:rPr>
+          <w:lang w:val="en-US"/>
+        </w:rPr>
+      </w:pPr>
+      <w:r>
+        <w:rPr>
+          <w:lang w:val="en-US"/>
+        </w:rPr>
+        <w:t>sns.violinplot(x='cluster', y='salario', data=df)</w:t>
+      </w:r>
+    </w:p>
+    <w:p>
+      <w:r>
+        <w:t>plt.title('Distribución por cluster')</w:t>
+      </w:r>
+    </w:p>
+    <w:p>
+      <w:pPr>
+        <w:rPr>
+          <w:lang w:val="en-US"/>
+        </w:rPr>
+      </w:pPr>
+      <w:r>
+        <w:rPr>
+          <w:lang w:val="en-US"/>
+        </w:rPr>
+        <w:t>plt.show()</w:t>
+      </w:r>
+      <w:r>
+        <w:rPr>
+          <w:lang w:val="en-US"/>
+        </w:rPr>
+        <w:br w:type="page"/>
+      </w:r>
+    </w:p>
+    <w:p>
+      <w:pPr>
+        <w:rPr>
+          <w:lang w:val="en-US"/>
+        </w:rPr>
+      </w:pPr>
     </w:p>
     <w:sectPr>
       <w:pgSz w:w="12240" w:h="15840"/>

</xml_diff>